<commit_message>
Add maps to 4 worksheets + 5 new map posters
</commit_message>
<xml_diff>
--- a/05_National_Dishes_Student_Worksheet.docx
+++ b/05_National_Dishes_Student_Worksheet.docx
@@ -650,6 +650,79 @@
           <w:sz w:val="20"/>
         </w:rPr>
         <w:t>Many Caribbean dishes have African roots. Jamaica's national dish, ackee and saltfish, uses ackee, a fruit brought from West Africa in the 1700s. Barbados has cou-cou (made from cornmeal and okra) with flying fish. Ethiopia's injera is a spongy flatbread made from a grain called teff, eaten with stews such as doro wat. You tear off a piece of injera and use it to scoop up the food.</w:t>
+      </w:r>
+    </w:p>
+    <w:p>
+      <w:pPr>
+        <w:keepNext/>
+        <w:spacing w:before="80" w:after="60"/>
+      </w:pPr>
+      <w:r>
+        <w:rPr>
+          <w:rFonts w:ascii="Aptos Display" w:hAnsi="Aptos Display"/>
+          <w:b/>
+          <w:i w:val="0"/>
+          <w:color w:val="007A3D"/>
+          <w:sz w:val="24"/>
+        </w:rPr>
+        <w:t>Map</w:t>
+      </w:r>
+    </w:p>
+    <w:p>
+      <w:pPr>
+        <w:keepNext/>
+        <w:spacing w:after="40"/>
+        <w:jc w:val="center"/>
+      </w:pPr>
+      <w:r>
+        <w:drawing>
+          <wp:inline xmlns:a="http://schemas.openxmlformats.org/drawingml/2006/main" xmlns:pic="http://schemas.openxmlformats.org/drawingml/2006/picture">
+            <wp:extent cx="5868000" cy="2789756"/>
+            <wp:docPr id="1" name="Picture 1" descr="Where the dishes in this session come from, and how ackee travelled from West Africa to the Caribbean."/>
+            <wp:cNvGraphicFramePr>
+              <a:graphicFrameLocks noChangeAspect="1"/>
+            </wp:cNvGraphicFramePr>
+            <a:graphic>
+              <a:graphicData uri="http://schemas.openxmlformats.org/drawingml/2006/picture">
+                <pic:pic>
+                  <pic:nvPicPr>
+                    <pic:cNvPr id="0" name="map_dishes.png"/>
+                    <pic:cNvPicPr/>
+                  </pic:nvPicPr>
+                  <pic:blipFill>
+                    <a:blip r:embed="rId15"/>
+                    <a:stretch>
+                      <a:fillRect/>
+                    </a:stretch>
+                  </pic:blipFill>
+                  <pic:spPr>
+                    <a:xfrm>
+                      <a:off x="0" y="0"/>
+                      <a:ext cx="5868000" cy="2789756"/>
+                    </a:xfrm>
+                    <a:prstGeom prst="rect"/>
+                  </pic:spPr>
+                </pic:pic>
+              </a:graphicData>
+            </a:graphic>
+          </wp:inline>
+        </w:drawing>
+      </w:r>
+    </w:p>
+    <w:p>
+      <w:pPr>
+        <w:spacing w:before="0" w:after="160"/>
+        <w:jc w:val="center"/>
+      </w:pPr>
+      <w:r>
+        <w:rPr>
+          <w:rFonts w:ascii="Aptos" w:hAnsi="Aptos"/>
+          <w:b w:val="0"/>
+          <w:i/>
+          <w:color w:val="5E5E5E"/>
+          <w:sz w:val="17"/>
+        </w:rPr>
+        <w:t>Where the dishes in this session come from, and how ackee travelled from West Africa to the Caribbean.</w:t>
       </w:r>
     </w:p>
     <w:tbl>

</xml_diff>

<commit_message>
Review fixes: align workshops 29-33 with series structure, tidy layouts
- 29-33 worksheets now follow the series sections (Warm-Up, Learn with Key words, Activities, Talk It Out, Reflection & Exit Ticket); guides gain Sensitivity & Safeguarding and Extension Ideas
- Removed an unused embedded map image from the 29-33 worksheets
- Fixed near-empty last pages in 05, 08, 20, 23 worksheets and the 28 guide

Co-Authored-By: Claude Opus 5.5 <noreply@anthropic.com>
Claude-Session: https://claude.ai/code/session_01SPv82zmeRu4bZc3xAHocQk
</commit_message>
<xml_diff>
--- a/05_National_Dishes_Student_Worksheet.docx
+++ b/05_National_Dishes_Student_Worksheet.docx
@@ -4,7 +4,7 @@
   <w:body>
     <w:p>
       <w:pPr>
-        <w:spacing w:before="0" w:after="40"/>
+        <w:spacing w:before="0" w:after="30"/>
       </w:pPr>
       <w:r>
         <w:rPr>
@@ -19,7 +19,7 @@
     </w:p>
     <w:p>
       <w:pPr>
-        <w:spacing w:before="0" w:after="40"/>
+        <w:spacing w:before="0" w:after="30"/>
       </w:pPr>
       <w:r>
         <w:rPr>
@@ -34,7 +34,7 @@
     </w:p>
     <w:p>
       <w:pPr>
-        <w:spacing w:before="0" w:after="120"/>
+        <w:spacing w:before="0" w:after="90"/>
       </w:pPr>
       <w:r>
         <w:rPr>
@@ -133,7 +133,7 @@
     </w:tbl>
     <w:p>
       <w:pPr>
-        <w:spacing w:before="100" w:after="160"/>
+        <w:spacing w:before="75" w:after="120"/>
       </w:pPr>
       <w:r>
         <w:rPr>
@@ -266,7 +266,7 @@
           <w:right w:val="single" w:sz="4" w:space="6" w:color="CE1126"/>
         </w:pBdr>
         <w:shd w:val="clear" w:color="auto" w:fill="CE1126"/>
-        <w:spacing w:before="200" w:after="120"/>
+        <w:spacing w:before="150" w:after="90"/>
         <w:ind w:left="68" w:right="68"/>
       </w:pPr>
       <w:r>
@@ -283,7 +283,7 @@
     <w:p>
       <w:pPr>
         <w:keepNext/>
-        <w:spacing w:before="0" w:after="80"/>
+        <w:spacing w:before="0" w:after="60"/>
       </w:pPr>
       <w:r>
         <w:rPr>
@@ -298,7 +298,7 @@
     </w:p>
     <w:p>
       <w:pPr>
-        <w:spacing w:after="60"/>
+        <w:spacing w:after="45"/>
         <w:ind w:left="454" w:hanging="255"/>
       </w:pPr>
       <w:r>
@@ -324,7 +324,7 @@
     </w:p>
     <w:p>
       <w:pPr>
-        <w:spacing w:after="60"/>
+        <w:spacing w:after="45"/>
         <w:ind w:left="454" w:hanging="255"/>
       </w:pPr>
       <w:r>
@@ -350,7 +350,7 @@
     </w:p>
     <w:p>
       <w:pPr>
-        <w:spacing w:after="60"/>
+        <w:spacing w:after="45"/>
         <w:ind w:left="454" w:hanging="255"/>
       </w:pPr>
       <w:r>
@@ -384,7 +384,7 @@
           <w:right w:val="single" w:sz="4" w:space="6" w:color="E8A800"/>
         </w:pBdr>
         <w:shd w:val="clear" w:color="auto" w:fill="E8A800"/>
-        <w:spacing w:before="200" w:after="120"/>
+        <w:spacing w:before="150" w:after="90"/>
         <w:ind w:left="68" w:right="68"/>
       </w:pPr>
       <w:r>
@@ -401,7 +401,7 @@
     <w:p>
       <w:pPr>
         <w:keepNext/>
-        <w:spacing w:before="40" w:after="60"/>
+        <w:spacing w:before="30" w:after="45"/>
       </w:pPr>
       <w:r>
         <w:rPr>
@@ -427,7 +427,7 @@
     <w:p>
       <w:pPr>
         <w:keepNext/>
-        <w:spacing w:before="0" w:after="40"/>
+        <w:spacing w:before="0" w:after="30"/>
       </w:pPr>
       <w:r>
         <w:rPr>
@@ -514,7 +514,7 @@
           <w:right w:val="single" w:sz="4" w:space="6" w:color="007A3D"/>
         </w:pBdr>
         <w:shd w:val="clear" w:color="auto" w:fill="007A3D"/>
-        <w:spacing w:before="200" w:after="120"/>
+        <w:spacing w:before="150" w:after="90"/>
         <w:ind w:left="68" w:right="68"/>
       </w:pPr>
       <w:r>
@@ -531,7 +531,7 @@
     <w:p>
       <w:pPr>
         <w:keepNext/>
-        <w:spacing w:before="80" w:after="60"/>
+        <w:spacing w:before="60" w:after="45"/>
       </w:pPr>
       <w:r>
         <w:rPr>
@@ -546,7 +546,7 @@
     </w:p>
     <w:p>
       <w:pPr>
-        <w:spacing w:before="0" w:after="120"/>
+        <w:spacing w:before="0" w:after="90"/>
       </w:pPr>
       <w:r>
         <w:rPr>
@@ -562,7 +562,7 @@
     <w:p>
       <w:pPr>
         <w:keepNext/>
-        <w:spacing w:before="80" w:after="60"/>
+        <w:spacing w:before="60" w:after="45"/>
       </w:pPr>
       <w:r>
         <w:rPr>
@@ -577,7 +577,7 @@
     </w:p>
     <w:p>
       <w:pPr>
-        <w:spacing w:before="0" w:after="120"/>
+        <w:spacing w:before="0" w:after="90"/>
       </w:pPr>
       <w:r>
         <w:rPr>
@@ -593,7 +593,7 @@
     <w:p>
       <w:pPr>
         <w:keepNext/>
-        <w:spacing w:before="80" w:after="60"/>
+        <w:spacing w:before="60" w:after="45"/>
       </w:pPr>
       <w:r>
         <w:rPr>
@@ -608,7 +608,7 @@
     </w:p>
     <w:p>
       <w:pPr>
-        <w:spacing w:before="0" w:after="120"/>
+        <w:spacing w:before="0" w:after="90"/>
       </w:pPr>
       <w:r>
         <w:rPr>
@@ -624,7 +624,7 @@
     <w:p>
       <w:pPr>
         <w:keepNext/>
-        <w:spacing w:before="80" w:after="60"/>
+        <w:spacing w:before="60" w:after="45"/>
       </w:pPr>
       <w:r>
         <w:rPr>
@@ -639,7 +639,7 @@
     </w:p>
     <w:p>
       <w:pPr>
-        <w:spacing w:before="0" w:after="120"/>
+        <w:spacing w:before="0" w:after="90"/>
       </w:pPr>
       <w:r>
         <w:rPr>
@@ -655,7 +655,7 @@
     <w:p>
       <w:pPr>
         <w:keepNext/>
-        <w:spacing w:before="80" w:after="60"/>
+        <w:spacing w:before="60" w:after="45"/>
       </w:pPr>
       <w:r>
         <w:rPr>
@@ -671,13 +671,13 @@
     <w:p>
       <w:pPr>
         <w:keepNext/>
-        <w:spacing w:after="40"/>
+        <w:spacing w:after="30"/>
         <w:jc w:val="center"/>
       </w:pPr>
       <w:r>
         <w:drawing>
           <wp:inline xmlns:a="http://schemas.openxmlformats.org/drawingml/2006/main" xmlns:pic="http://schemas.openxmlformats.org/drawingml/2006/picture">
-            <wp:extent cx="5868000" cy="2789756"/>
+            <wp:extent cx="5281200" cy="2510780"/>
             <wp:docPr id="1" name="Picture 1" descr="Where the dishes in this session come from, and how ackee travelled from West Africa to the Caribbean."/>
             <wp:cNvGraphicFramePr>
               <a:graphicFrameLocks noChangeAspect="1"/>
@@ -698,7 +698,7 @@
                   <pic:spPr>
                     <a:xfrm>
                       <a:off x="0" y="0"/>
-                      <a:ext cx="5868000" cy="2789756"/>
+                      <a:ext cx="5281200" cy="2510780"/>
                     </a:xfrm>
                     <a:prstGeom prst="rect"/>
                   </pic:spPr>
@@ -711,7 +711,7 @@
     </w:p>
     <w:p>
       <w:pPr>
-        <w:spacing w:before="0" w:after="160"/>
+        <w:spacing w:before="0" w:after="120"/>
         <w:jc w:val="center"/>
       </w:pPr>
       <w:r>
@@ -758,7 +758,7 @@
           </w:tcPr>
           <w:p>
             <w:pPr>
-              <w:spacing w:after="60"/>
+              <w:spacing w:after="45"/>
             </w:pPr>
             <w:r>
               <w:rPr>
@@ -1548,7 +1548,7 @@
     <w:p>
       <w:pPr>
         <w:keepNext/>
-        <w:spacing w:before="80" w:after="60"/>
+        <w:spacing w:before="60" w:after="45"/>
       </w:pPr>
       <w:r>
         <w:rPr>
@@ -2023,7 +2023,7 @@
           <w:right w:val="single" w:sz="4" w:space="6" w:color="CE1126"/>
         </w:pBdr>
         <w:shd w:val="clear" w:color="auto" w:fill="CE1126"/>
-        <w:spacing w:before="200" w:after="120"/>
+        <w:spacing w:before="150" w:after="90"/>
         <w:ind w:left="68" w:right="68"/>
       </w:pPr>
       <w:r>
@@ -2040,7 +2040,7 @@
     <w:p>
       <w:pPr>
         <w:keepNext/>
-        <w:spacing w:before="40" w:after="60"/>
+        <w:spacing w:before="30" w:after="45"/>
       </w:pPr>
       <w:r>
         <w:rPr>
@@ -2725,7 +2725,7 @@
     <w:p>
       <w:pPr>
         <w:keepNext/>
-        <w:spacing w:before="40" w:after="60"/>
+        <w:spacing w:before="30" w:after="45"/>
       </w:pPr>
       <w:r>
         <w:rPr>
@@ -3351,7 +3351,7 @@
     <w:p>
       <w:pPr>
         <w:keepNext/>
-        <w:spacing w:before="40" w:after="60"/>
+        <w:spacing w:before="30" w:after="45"/>
       </w:pPr>
       <w:r>
         <w:rPr>
@@ -3576,7 +3576,7 @@
     </w:p>
     <w:p>
       <w:pPr>
-        <w:spacing w:before="0" w:after="120"/>
+        <w:spacing w:before="0" w:after="90"/>
       </w:pPr>
       <w:r>
         <w:rPr>
@@ -3601,7 +3601,7 @@
     </w:p>
     <w:p>
       <w:pPr>
-        <w:spacing w:before="0" w:after="120"/>
+        <w:spacing w:before="0" w:after="90"/>
       </w:pPr>
       <w:r>
         <w:rPr>
@@ -3626,7 +3626,7 @@
     </w:p>
     <w:p>
       <w:pPr>
-        <w:spacing w:before="0" w:after="120"/>
+        <w:spacing w:before="0" w:after="90"/>
       </w:pPr>
       <w:r>
         <w:rPr>
@@ -3651,7 +3651,7 @@
     </w:p>
     <w:p>
       <w:pPr>
-        <w:spacing w:before="0" w:after="120"/>
+        <w:spacing w:before="0" w:after="90"/>
       </w:pPr>
       <w:r>
         <w:rPr>
@@ -3676,7 +3676,7 @@
     </w:p>
     <w:p>
       <w:pPr>
-        <w:spacing w:before="0" w:after="120"/>
+        <w:spacing w:before="0" w:after="90"/>
       </w:pPr>
       <w:r>
         <w:rPr>
@@ -3719,7 +3719,7 @@
           <w:right w:val="single" w:sz="4" w:space="6" w:color="E8A800"/>
         </w:pBdr>
         <w:shd w:val="clear" w:color="auto" w:fill="E8A800"/>
-        <w:spacing w:before="200" w:after="120"/>
+        <w:spacing w:before="150" w:after="90"/>
         <w:ind w:left="68" w:right="68"/>
       </w:pPr>
       <w:r>
@@ -3736,7 +3736,7 @@
     <w:p>
       <w:pPr>
         <w:keepNext/>
-        <w:spacing w:before="40" w:after="60"/>
+        <w:spacing w:before="30" w:after="45"/>
       </w:pPr>
       <w:r>
         <w:rPr>
@@ -3761,7 +3761,7 @@
     </w:p>
     <w:p>
       <w:pPr>
-        <w:spacing w:after="60"/>
+        <w:spacing w:after="45"/>
         <w:ind w:left="454" w:hanging="255"/>
       </w:pPr>
       <w:r>
@@ -3787,7 +3787,7 @@
     </w:p>
     <w:p>
       <w:pPr>
-        <w:spacing w:after="60"/>
+        <w:spacing w:after="45"/>
         <w:ind w:left="454" w:hanging="255"/>
       </w:pPr>
       <w:r>
@@ -3813,7 +3813,7 @@
     </w:p>
     <w:p>
       <w:pPr>
-        <w:spacing w:after="60"/>
+        <w:spacing w:after="45"/>
         <w:ind w:left="454" w:hanging="255"/>
       </w:pPr>
       <w:r>
@@ -3850,7 +3850,7 @@
     <w:p>
       <w:pPr>
         <w:keepNext/>
-        <w:spacing w:before="40" w:after="60"/>
+        <w:spacing w:before="30" w:after="45"/>
       </w:pPr>
       <w:r>
         <w:rPr>
@@ -3957,7 +3957,7 @@
           </w:tcPr>
           <w:p>
             <w:pPr>
-              <w:spacing w:after="40"/>
+              <w:spacing w:after="30"/>
             </w:pPr>
             <w:r>
               <w:rPr>
@@ -4005,7 +4005,7 @@
           </w:tcPr>
           <w:p>
             <w:pPr>
-              <w:spacing w:after="40"/>
+              <w:spacing w:after="30"/>
             </w:pPr>
             <w:r>
               <w:rPr>
@@ -4056,7 +4056,7 @@
           <w:right w:val="single" w:sz="4" w:space="6" w:color="007A3D"/>
         </w:pBdr>
         <w:shd w:val="clear" w:color="auto" w:fill="007A3D"/>
-        <w:spacing w:before="200" w:after="120"/>
+        <w:spacing w:before="150" w:after="90"/>
         <w:ind w:left="68" w:right="68"/>
       </w:pPr>
       <w:r>
@@ -4073,7 +4073,7 @@
     <w:p>
       <w:pPr>
         <w:keepNext/>
-        <w:spacing w:before="40" w:after="60"/>
+        <w:spacing w:before="30" w:after="45"/>
       </w:pPr>
       <w:r>
         <w:rPr>
@@ -4099,7 +4099,7 @@
     <w:p>
       <w:pPr>
         <w:keepNext/>
-        <w:spacing w:before="0" w:after="80"/>
+        <w:spacing w:before="0" w:after="60"/>
       </w:pPr>
       <w:r>
         <w:rPr>
@@ -4385,7 +4385,7 @@
     <w:p>
       <w:pPr>
         <w:keepNext/>
-        <w:spacing w:before="120" w:after="0"/>
+        <w:spacing w:before="90" w:after="0"/>
       </w:pPr>
       <w:r>
         <w:rPr>
@@ -4443,7 +4443,7 @@
     <w:p>
       <w:pPr>
         <w:keepNext/>
-        <w:spacing w:before="40" w:after="60"/>
+        <w:spacing w:before="30" w:after="45"/>
       </w:pPr>
       <w:r>
         <w:rPr>
@@ -4469,7 +4469,7 @@
     <w:p>
       <w:pPr>
         <w:keepNext/>
-        <w:spacing w:before="0" w:after="80"/>
+        <w:spacing w:before="0" w:after="60"/>
       </w:pPr>
       <w:r>
         <w:rPr>
@@ -4760,7 +4760,7 @@
     <w:p>
       <w:pPr>
         <w:keepNext/>
-        <w:spacing w:before="0" w:after="40"/>
+        <w:spacing w:before="0" w:after="30"/>
       </w:pPr>
       <w:r>
         <w:rPr>

</xml_diff>